<commit_message>
finalizing my DAV project with screenshots and documentation
</commit_message>
<xml_diff>
--- a/DAV Capstone project/Project.docx
+++ b/DAV Capstone project/Project.docx
@@ -544,7 +544,6 @@
           <w:rFonts w:asciiTheme="minorHAnsi" w:hAnsiTheme="minorHAnsi" w:cstheme="minorHAnsi"/>
           <w:sz w:val="22"/>
           <w:szCs w:val="22"/>
-          <w:highlight w:val="yellow"/>
         </w:rPr>
       </w:pPr>
       <w:r>
@@ -553,7 +552,6 @@
           <w:rFonts w:asciiTheme="minorHAnsi" w:hAnsiTheme="minorHAnsi" w:cstheme="minorHAnsi"/>
           <w:sz w:val="22"/>
           <w:szCs w:val="22"/>
-          <w:highlight w:val="yellow"/>
         </w:rPr>
         <w:t>Exploration</w:t>
       </w:r>
@@ -562,7 +560,6 @@
           <w:rFonts w:asciiTheme="minorHAnsi" w:hAnsiTheme="minorHAnsi" w:cstheme="minorHAnsi"/>
           <w:sz w:val="22"/>
           <w:szCs w:val="22"/>
-          <w:highlight w:val="yellow"/>
         </w:rPr>
         <w:t xml:space="preserve">: Review the tables </w:t>
       </w:r>
@@ -572,7 +569,6 @@
           <w:rFonts w:asciiTheme="minorHAnsi" w:hAnsiTheme="minorHAnsi" w:cstheme="minorHAnsi"/>
           <w:sz w:val="22"/>
           <w:szCs w:val="22"/>
-          <w:highlight w:val="yellow"/>
         </w:rPr>
         <w:t>orders</w:t>
       </w:r>
@@ -581,7 +577,6 @@
           <w:rFonts w:asciiTheme="minorHAnsi" w:hAnsiTheme="minorHAnsi" w:cstheme="minorHAnsi"/>
           <w:sz w:val="22"/>
           <w:szCs w:val="22"/>
-          <w:highlight w:val="yellow"/>
         </w:rPr>
         <w:t xml:space="preserve">, </w:t>
       </w:r>
@@ -592,7 +587,6 @@
           <w:rFonts w:asciiTheme="minorHAnsi" w:hAnsiTheme="minorHAnsi" w:cstheme="minorHAnsi"/>
           <w:sz w:val="22"/>
           <w:szCs w:val="22"/>
-          <w:highlight w:val="yellow"/>
         </w:rPr>
         <w:t>order_details</w:t>
       </w:r>
@@ -602,7 +596,6 @@
           <w:rFonts w:asciiTheme="minorHAnsi" w:hAnsiTheme="minorHAnsi" w:cstheme="minorHAnsi"/>
           <w:sz w:val="22"/>
           <w:szCs w:val="22"/>
-          <w:highlight w:val="yellow"/>
         </w:rPr>
         <w:t xml:space="preserve">, </w:t>
       </w:r>
@@ -612,7 +605,6 @@
           <w:rFonts w:asciiTheme="minorHAnsi" w:hAnsiTheme="minorHAnsi" w:cstheme="minorHAnsi"/>
           <w:sz w:val="22"/>
           <w:szCs w:val="22"/>
-          <w:highlight w:val="yellow"/>
         </w:rPr>
         <w:t>products</w:t>
       </w:r>
@@ -621,7 +613,6 @@
           <w:rFonts w:asciiTheme="minorHAnsi" w:hAnsiTheme="minorHAnsi" w:cstheme="minorHAnsi"/>
           <w:sz w:val="22"/>
           <w:szCs w:val="22"/>
-          <w:highlight w:val="yellow"/>
         </w:rPr>
         <w:t xml:space="preserve">, </w:t>
       </w:r>
@@ -631,7 +622,6 @@
           <w:rFonts w:asciiTheme="minorHAnsi" w:hAnsiTheme="minorHAnsi" w:cstheme="minorHAnsi"/>
           <w:sz w:val="22"/>
           <w:szCs w:val="22"/>
-          <w:highlight w:val="yellow"/>
         </w:rPr>
         <w:t>categories</w:t>
       </w:r>
@@ -640,7 +630,6 @@
           <w:rFonts w:asciiTheme="minorHAnsi" w:hAnsiTheme="minorHAnsi" w:cstheme="minorHAnsi"/>
           <w:sz w:val="22"/>
           <w:szCs w:val="22"/>
-          <w:highlight w:val="yellow"/>
         </w:rPr>
         <w:t xml:space="preserve">, </w:t>
       </w:r>
@@ -650,7 +639,6 @@
           <w:rFonts w:asciiTheme="minorHAnsi" w:hAnsiTheme="minorHAnsi" w:cstheme="minorHAnsi"/>
           <w:sz w:val="22"/>
           <w:szCs w:val="22"/>
-          <w:highlight w:val="yellow"/>
         </w:rPr>
         <w:t>customers</w:t>
       </w:r>
@@ -659,7 +647,6 @@
           <w:rFonts w:asciiTheme="minorHAnsi" w:hAnsiTheme="minorHAnsi" w:cstheme="minorHAnsi"/>
           <w:sz w:val="22"/>
           <w:szCs w:val="22"/>
-          <w:highlight w:val="yellow"/>
         </w:rPr>
         <w:t xml:space="preserve">, </w:t>
       </w:r>
@@ -669,7 +656,6 @@
           <w:rFonts w:asciiTheme="minorHAnsi" w:hAnsiTheme="minorHAnsi" w:cstheme="minorHAnsi"/>
           <w:sz w:val="22"/>
           <w:szCs w:val="22"/>
-          <w:highlight w:val="yellow"/>
         </w:rPr>
         <w:t>employees</w:t>
       </w:r>
@@ -678,7 +664,6 @@
           <w:rFonts w:asciiTheme="minorHAnsi" w:hAnsiTheme="minorHAnsi" w:cstheme="minorHAnsi"/>
           <w:sz w:val="22"/>
           <w:szCs w:val="22"/>
-          <w:highlight w:val="yellow"/>
         </w:rPr>
         <w:t xml:space="preserve">, </w:t>
       </w:r>
@@ -688,7 +673,6 @@
           <w:rFonts w:asciiTheme="minorHAnsi" w:hAnsiTheme="minorHAnsi" w:cstheme="minorHAnsi"/>
           <w:sz w:val="22"/>
           <w:szCs w:val="22"/>
-          <w:highlight w:val="yellow"/>
         </w:rPr>
         <w:t>shippers</w:t>
       </w:r>
@@ -697,7 +681,6 @@
           <w:rFonts w:asciiTheme="minorHAnsi" w:hAnsiTheme="minorHAnsi" w:cstheme="minorHAnsi"/>
           <w:sz w:val="22"/>
           <w:szCs w:val="22"/>
-          <w:highlight w:val="yellow"/>
         </w:rPr>
         <w:t xml:space="preserve">, and </w:t>
       </w:r>
@@ -707,7 +690,6 @@
           <w:rFonts w:asciiTheme="minorHAnsi" w:hAnsiTheme="minorHAnsi" w:cstheme="minorHAnsi"/>
           <w:sz w:val="22"/>
           <w:szCs w:val="22"/>
-          <w:highlight w:val="yellow"/>
         </w:rPr>
         <w:t>suppliers</w:t>
       </w:r>
@@ -716,7 +698,6 @@
           <w:rFonts w:asciiTheme="minorHAnsi" w:hAnsiTheme="minorHAnsi" w:cstheme="minorHAnsi"/>
           <w:sz w:val="22"/>
           <w:szCs w:val="22"/>
-          <w:highlight w:val="yellow"/>
         </w:rPr>
         <w:t>.</w:t>
       </w:r>
@@ -732,7 +713,6 @@
           <w:rFonts w:asciiTheme="minorHAnsi" w:hAnsiTheme="minorHAnsi" w:cstheme="minorHAnsi"/>
           <w:sz w:val="22"/>
           <w:szCs w:val="22"/>
-          <w:highlight w:val="yellow"/>
         </w:rPr>
       </w:pPr>
       <w:r>
@@ -741,7 +721,6 @@
           <w:rFonts w:asciiTheme="minorHAnsi" w:hAnsiTheme="minorHAnsi" w:cstheme="minorHAnsi"/>
           <w:sz w:val="22"/>
           <w:szCs w:val="22"/>
-          <w:highlight w:val="yellow"/>
         </w:rPr>
         <w:t>Creating Views</w:t>
       </w:r>
@@ -750,7 +729,6 @@
           <w:rFonts w:asciiTheme="minorHAnsi" w:hAnsiTheme="minorHAnsi" w:cstheme="minorHAnsi"/>
           <w:sz w:val="22"/>
           <w:szCs w:val="22"/>
-          <w:highlight w:val="yellow"/>
         </w:rPr>
         <w:t>:</w:t>
       </w:r>
@@ -766,7 +744,6 @@
           <w:rFonts w:asciiTheme="minorHAnsi" w:hAnsiTheme="minorHAnsi" w:cstheme="minorHAnsi"/>
           <w:sz w:val="22"/>
           <w:szCs w:val="22"/>
-          <w:highlight w:val="yellow"/>
         </w:rPr>
       </w:pPr>
       <w:r>
@@ -775,7 +752,6 @@
           <w:rFonts w:asciiTheme="minorHAnsi" w:hAnsiTheme="minorHAnsi" w:cstheme="minorHAnsi"/>
           <w:sz w:val="22"/>
           <w:szCs w:val="22"/>
-          <w:highlight w:val="yellow"/>
         </w:rPr>
         <w:t>Task 1</w:t>
       </w:r>
@@ -784,7 +760,6 @@
           <w:rFonts w:asciiTheme="minorHAnsi" w:hAnsiTheme="minorHAnsi" w:cstheme="minorHAnsi"/>
           <w:sz w:val="22"/>
           <w:szCs w:val="22"/>
-          <w:highlight w:val="yellow"/>
         </w:rPr>
         <w:t xml:space="preserve">: Create a view named </w:t>
       </w:r>
@@ -795,7 +770,6 @@
           <w:rFonts w:asciiTheme="minorHAnsi" w:hAnsiTheme="minorHAnsi" w:cstheme="minorHAnsi"/>
           <w:sz w:val="22"/>
           <w:szCs w:val="22"/>
-          <w:highlight w:val="yellow"/>
         </w:rPr>
         <w:t>v_Product_Enriched</w:t>
       </w:r>
@@ -805,7 +779,6 @@
           <w:rFonts w:asciiTheme="minorHAnsi" w:hAnsiTheme="minorHAnsi" w:cstheme="minorHAnsi"/>
           <w:sz w:val="22"/>
           <w:szCs w:val="22"/>
-          <w:highlight w:val="yellow"/>
         </w:rPr>
         <w:t xml:space="preserve">. It should combine </w:t>
       </w:r>
@@ -815,7 +788,6 @@
           <w:rFonts w:asciiTheme="minorHAnsi" w:hAnsiTheme="minorHAnsi" w:cstheme="minorHAnsi"/>
           <w:sz w:val="22"/>
           <w:szCs w:val="22"/>
-          <w:highlight w:val="yellow"/>
         </w:rPr>
         <w:t>products</w:t>
       </w:r>
@@ -824,7 +796,6 @@
           <w:rFonts w:asciiTheme="minorHAnsi" w:hAnsiTheme="minorHAnsi" w:cstheme="minorHAnsi"/>
           <w:sz w:val="22"/>
           <w:szCs w:val="22"/>
-          <w:highlight w:val="yellow"/>
         </w:rPr>
         <w:t xml:space="preserve">, </w:t>
       </w:r>
@@ -834,7 +805,6 @@
           <w:rFonts w:asciiTheme="minorHAnsi" w:hAnsiTheme="minorHAnsi" w:cstheme="minorHAnsi"/>
           <w:sz w:val="22"/>
           <w:szCs w:val="22"/>
-          <w:highlight w:val="yellow"/>
         </w:rPr>
         <w:t>categories</w:t>
       </w:r>
@@ -843,7 +813,6 @@
           <w:rFonts w:asciiTheme="minorHAnsi" w:hAnsiTheme="minorHAnsi" w:cstheme="minorHAnsi"/>
           <w:sz w:val="22"/>
           <w:szCs w:val="22"/>
-          <w:highlight w:val="yellow"/>
         </w:rPr>
         <w:t xml:space="preserve">, and </w:t>
       </w:r>
@@ -853,7 +822,6 @@
           <w:rFonts w:asciiTheme="minorHAnsi" w:hAnsiTheme="minorHAnsi" w:cstheme="minorHAnsi"/>
           <w:sz w:val="22"/>
           <w:szCs w:val="22"/>
-          <w:highlight w:val="yellow"/>
         </w:rPr>
         <w:t>suppliers</w:t>
       </w:r>
@@ -862,7 +830,6 @@
           <w:rFonts w:asciiTheme="minorHAnsi" w:hAnsiTheme="minorHAnsi" w:cstheme="minorHAnsi"/>
           <w:sz w:val="22"/>
           <w:szCs w:val="22"/>
-          <w:highlight w:val="yellow"/>
         </w:rPr>
         <w:t xml:space="preserve"> to produce a clean dimension containing:</w:t>
       </w:r>
@@ -878,15 +845,13 @@
           <w:rFonts w:asciiTheme="minorHAnsi" w:hAnsiTheme="minorHAnsi" w:cstheme="minorHAnsi"/>
           <w:sz w:val="22"/>
           <w:szCs w:val="22"/>
-          <w:highlight w:val="yellow"/>
-        </w:rPr>
-      </w:pPr>
-      <w:r>
-        <w:rPr>
-          <w:rFonts w:asciiTheme="minorHAnsi" w:hAnsiTheme="minorHAnsi" w:cstheme="minorHAnsi"/>
-          <w:sz w:val="22"/>
-          <w:szCs w:val="22"/>
-          <w:highlight w:val="yellow"/>
+        </w:rPr>
+      </w:pPr>
+      <w:r>
+        <w:rPr>
+          <w:rFonts w:asciiTheme="minorHAnsi" w:hAnsiTheme="minorHAnsi" w:cstheme="minorHAnsi"/>
+          <w:sz w:val="22"/>
+          <w:szCs w:val="22"/>
         </w:rPr>
         <w:t>Product ID, Product Name</w:t>
       </w:r>
@@ -902,15 +867,13 @@
           <w:rFonts w:asciiTheme="minorHAnsi" w:hAnsiTheme="minorHAnsi" w:cstheme="minorHAnsi"/>
           <w:sz w:val="22"/>
           <w:szCs w:val="22"/>
-          <w:highlight w:val="yellow"/>
-        </w:rPr>
-      </w:pPr>
-      <w:r>
-        <w:rPr>
-          <w:rFonts w:asciiTheme="minorHAnsi" w:hAnsiTheme="minorHAnsi" w:cstheme="minorHAnsi"/>
-          <w:sz w:val="22"/>
-          <w:szCs w:val="22"/>
-          <w:highlight w:val="yellow"/>
+        </w:rPr>
+      </w:pPr>
+      <w:r>
+        <w:rPr>
+          <w:rFonts w:asciiTheme="minorHAnsi" w:hAnsiTheme="minorHAnsi" w:cstheme="minorHAnsi"/>
+          <w:sz w:val="22"/>
+          <w:szCs w:val="22"/>
         </w:rPr>
         <w:t>Category Name</w:t>
       </w:r>
@@ -926,15 +889,13 @@
           <w:rFonts w:asciiTheme="minorHAnsi" w:hAnsiTheme="minorHAnsi" w:cstheme="minorHAnsi"/>
           <w:sz w:val="22"/>
           <w:szCs w:val="22"/>
-          <w:highlight w:val="yellow"/>
-        </w:rPr>
-      </w:pPr>
-      <w:r>
-        <w:rPr>
-          <w:rFonts w:asciiTheme="minorHAnsi" w:hAnsiTheme="minorHAnsi" w:cstheme="minorHAnsi"/>
-          <w:sz w:val="22"/>
-          <w:szCs w:val="22"/>
-          <w:highlight w:val="yellow"/>
+        </w:rPr>
+      </w:pPr>
+      <w:r>
+        <w:rPr>
+          <w:rFonts w:asciiTheme="minorHAnsi" w:hAnsiTheme="minorHAnsi" w:cstheme="minorHAnsi"/>
+          <w:sz w:val="22"/>
+          <w:szCs w:val="22"/>
         </w:rPr>
         <w:t xml:space="preserve">Supplier Company Name (rename to </w:t>
       </w:r>
@@ -944,7 +905,6 @@
           <w:rFonts w:asciiTheme="minorHAnsi" w:hAnsiTheme="minorHAnsi" w:cstheme="minorHAnsi"/>
           <w:sz w:val="22"/>
           <w:szCs w:val="22"/>
-          <w:highlight w:val="yellow"/>
         </w:rPr>
         <w:t>Supplier</w:t>
       </w:r>
@@ -953,7 +913,6 @@
           <w:rFonts w:asciiTheme="minorHAnsi" w:hAnsiTheme="minorHAnsi" w:cstheme="minorHAnsi"/>
           <w:sz w:val="22"/>
           <w:szCs w:val="22"/>
-          <w:highlight w:val="yellow"/>
         </w:rPr>
         <w:t>)</w:t>
       </w:r>
@@ -969,15 +928,13 @@
           <w:rFonts w:asciiTheme="minorHAnsi" w:hAnsiTheme="minorHAnsi" w:cstheme="minorHAnsi"/>
           <w:sz w:val="22"/>
           <w:szCs w:val="22"/>
-          <w:highlight w:val="yellow"/>
-        </w:rPr>
-      </w:pPr>
-      <w:r>
-        <w:rPr>
-          <w:rFonts w:asciiTheme="minorHAnsi" w:hAnsiTheme="minorHAnsi" w:cstheme="minorHAnsi"/>
-          <w:sz w:val="22"/>
-          <w:szCs w:val="22"/>
-          <w:highlight w:val="yellow"/>
+        </w:rPr>
+      </w:pPr>
+      <w:r>
+        <w:rPr>
+          <w:rFonts w:asciiTheme="minorHAnsi" w:hAnsiTheme="minorHAnsi" w:cstheme="minorHAnsi"/>
+          <w:sz w:val="22"/>
+          <w:szCs w:val="22"/>
         </w:rPr>
         <w:t>Unit Price</w:t>
       </w:r>
@@ -993,7 +950,6 @@
           <w:rFonts w:asciiTheme="minorHAnsi" w:hAnsiTheme="minorHAnsi" w:cstheme="minorHAnsi"/>
           <w:sz w:val="22"/>
           <w:szCs w:val="22"/>
-          <w:highlight w:val="yellow"/>
         </w:rPr>
       </w:pPr>
       <w:r>
@@ -1002,7 +958,6 @@
           <w:rFonts w:asciiTheme="minorHAnsi" w:hAnsiTheme="minorHAnsi" w:cstheme="minorHAnsi"/>
           <w:sz w:val="22"/>
           <w:szCs w:val="22"/>
-          <w:highlight w:val="yellow"/>
         </w:rPr>
         <w:t>Task 2</w:t>
       </w:r>
@@ -1011,7 +966,6 @@
           <w:rFonts w:asciiTheme="minorHAnsi" w:hAnsiTheme="minorHAnsi" w:cstheme="minorHAnsi"/>
           <w:sz w:val="22"/>
           <w:szCs w:val="22"/>
-          <w:highlight w:val="yellow"/>
         </w:rPr>
         <w:t xml:space="preserve">: Create a view named </w:t>
       </w:r>
@@ -1022,7 +976,6 @@
           <w:rFonts w:asciiTheme="minorHAnsi" w:hAnsiTheme="minorHAnsi" w:cstheme="minorHAnsi"/>
           <w:sz w:val="22"/>
           <w:szCs w:val="22"/>
-          <w:highlight w:val="yellow"/>
         </w:rPr>
         <w:t>v_Order_Sales</w:t>
       </w:r>
@@ -1032,7 +985,6 @@
           <w:rFonts w:asciiTheme="minorHAnsi" w:hAnsiTheme="minorHAnsi" w:cstheme="minorHAnsi"/>
           <w:sz w:val="22"/>
           <w:szCs w:val="22"/>
-          <w:highlight w:val="yellow"/>
         </w:rPr>
         <w:t xml:space="preserve">. It should combine </w:t>
       </w:r>
@@ -1042,7 +994,6 @@
           <w:rFonts w:asciiTheme="minorHAnsi" w:hAnsiTheme="minorHAnsi" w:cstheme="minorHAnsi"/>
           <w:sz w:val="22"/>
           <w:szCs w:val="22"/>
-          <w:highlight w:val="yellow"/>
         </w:rPr>
         <w:t>orders</w:t>
       </w:r>
@@ -1051,7 +1002,6 @@
           <w:rFonts w:asciiTheme="minorHAnsi" w:hAnsiTheme="minorHAnsi" w:cstheme="minorHAnsi"/>
           <w:sz w:val="22"/>
           <w:szCs w:val="22"/>
-          <w:highlight w:val="yellow"/>
         </w:rPr>
         <w:t xml:space="preserve"> and </w:t>
       </w:r>
@@ -1062,7 +1012,6 @@
           <w:rFonts w:asciiTheme="minorHAnsi" w:hAnsiTheme="minorHAnsi" w:cstheme="minorHAnsi"/>
           <w:sz w:val="22"/>
           <w:szCs w:val="22"/>
-          <w:highlight w:val="yellow"/>
         </w:rPr>
         <w:t>order_details</w:t>
       </w:r>
@@ -1072,7 +1021,6 @@
           <w:rFonts w:asciiTheme="minorHAnsi" w:hAnsiTheme="minorHAnsi" w:cstheme="minorHAnsi"/>
           <w:sz w:val="22"/>
           <w:szCs w:val="22"/>
-          <w:highlight w:val="yellow"/>
         </w:rPr>
         <w:t xml:space="preserve"> to create a flat fact table. Include a calculated column </w:t>
       </w:r>
@@ -1083,7 +1031,6 @@
           <w:rFonts w:asciiTheme="minorHAnsi" w:hAnsiTheme="minorHAnsi" w:cstheme="minorHAnsi"/>
           <w:sz w:val="22"/>
           <w:szCs w:val="22"/>
-          <w:highlight w:val="yellow"/>
         </w:rPr>
         <w:t>TotalLineAmount</w:t>
       </w:r>
@@ -1093,7 +1040,6 @@
           <w:rFonts w:asciiTheme="minorHAnsi" w:hAnsiTheme="minorHAnsi" w:cstheme="minorHAnsi"/>
           <w:sz w:val="22"/>
           <w:szCs w:val="22"/>
-          <w:highlight w:val="yellow"/>
         </w:rPr>
         <w:t xml:space="preserve"> directly in SQL (</w:t>
       </w:r>
@@ -1104,7 +1050,6 @@
           <w:rFonts w:asciiTheme="minorHAnsi" w:hAnsiTheme="minorHAnsi" w:cstheme="minorHAnsi"/>
           <w:sz w:val="22"/>
           <w:szCs w:val="22"/>
-          <w:highlight w:val="yellow"/>
         </w:rPr>
         <w:t>unit_price</w:t>
       </w:r>
@@ -1115,7 +1060,6 @@
           <w:rFonts w:asciiTheme="minorHAnsi" w:hAnsiTheme="minorHAnsi" w:cstheme="minorHAnsi"/>
           <w:sz w:val="22"/>
           <w:szCs w:val="22"/>
-          <w:highlight w:val="yellow"/>
         </w:rPr>
         <w:t xml:space="preserve"> * quantity * (1 - discount)</w:t>
       </w:r>
@@ -1124,10 +1068,11 @@
           <w:rFonts w:asciiTheme="minorHAnsi" w:hAnsiTheme="minorHAnsi" w:cstheme="minorHAnsi"/>
           <w:sz w:val="22"/>
           <w:szCs w:val="22"/>
-          <w:highlight w:val="yellow"/>
         </w:rPr>
         <w:t>).</w:t>
       </w:r>
+      <w:bookmarkStart w:id="0" w:name="_GoBack"/>
+      <w:bookmarkEnd w:id="0"/>
     </w:p>
     <w:p>
       <w:pPr>
@@ -1140,7 +1085,6 @@
           <w:rFonts w:asciiTheme="minorHAnsi" w:hAnsiTheme="minorHAnsi" w:cstheme="minorHAnsi"/>
           <w:sz w:val="22"/>
           <w:szCs w:val="22"/>
-          <w:highlight w:val="yellow"/>
         </w:rPr>
       </w:pPr>
       <w:r>
@@ -1149,7 +1093,6 @@
           <w:rFonts w:asciiTheme="minorHAnsi" w:hAnsiTheme="minorHAnsi" w:cstheme="minorHAnsi"/>
           <w:sz w:val="22"/>
           <w:szCs w:val="22"/>
-          <w:highlight w:val="yellow"/>
         </w:rPr>
         <w:t>Task 3</w:t>
       </w:r>
@@ -1158,7 +1101,6 @@
           <w:rFonts w:asciiTheme="minorHAnsi" w:hAnsiTheme="minorHAnsi" w:cstheme="minorHAnsi"/>
           <w:sz w:val="22"/>
           <w:szCs w:val="22"/>
-          <w:highlight w:val="yellow"/>
         </w:rPr>
         <w:t xml:space="preserve">: Create a view </w:t>
       </w:r>
@@ -1169,7 +1111,6 @@
           <w:rFonts w:asciiTheme="minorHAnsi" w:hAnsiTheme="minorHAnsi" w:cstheme="minorHAnsi"/>
           <w:sz w:val="22"/>
           <w:szCs w:val="22"/>
-          <w:highlight w:val="yellow"/>
         </w:rPr>
         <w:t>v_Customer_Geo</w:t>
       </w:r>
@@ -1179,7 +1120,6 @@
           <w:rFonts w:asciiTheme="minorHAnsi" w:hAnsiTheme="minorHAnsi" w:cstheme="minorHAnsi"/>
           <w:sz w:val="22"/>
           <w:szCs w:val="22"/>
-          <w:highlight w:val="yellow"/>
         </w:rPr>
         <w:t>. Extract only active customers and their locations (City, Country) to facilitate geographic analysis.</w:t>
       </w:r>
@@ -1208,7 +1148,6 @@
           <w:rFonts w:asciiTheme="minorHAnsi" w:hAnsiTheme="minorHAnsi" w:cstheme="minorHAnsi"/>
           <w:sz w:val="22"/>
           <w:szCs w:val="22"/>
-          <w:highlight w:val="yellow"/>
         </w:rPr>
       </w:pPr>
       <w:r>
@@ -1217,7 +1156,6 @@
           <w:rFonts w:asciiTheme="minorHAnsi" w:hAnsiTheme="minorHAnsi" w:cstheme="minorHAnsi"/>
           <w:sz w:val="22"/>
           <w:szCs w:val="22"/>
-          <w:highlight w:val="yellow"/>
         </w:rPr>
         <w:t>Connection</w:t>
       </w:r>
@@ -1226,7 +1164,6 @@
           <w:rFonts w:asciiTheme="minorHAnsi" w:hAnsiTheme="minorHAnsi" w:cstheme="minorHAnsi"/>
           <w:sz w:val="22"/>
           <w:szCs w:val="22"/>
-          <w:highlight w:val="yellow"/>
         </w:rPr>
         <w:t>: Connect Power BI to the local PostgreSQL database.</w:t>
       </w:r>
@@ -1242,7 +1179,6 @@
           <w:rFonts w:asciiTheme="minorHAnsi" w:hAnsiTheme="minorHAnsi" w:cstheme="minorHAnsi"/>
           <w:sz w:val="22"/>
           <w:szCs w:val="22"/>
-          <w:highlight w:val="yellow"/>
         </w:rPr>
       </w:pPr>
       <w:r>
@@ -1251,7 +1187,6 @@
           <w:rFonts w:asciiTheme="minorHAnsi" w:hAnsiTheme="minorHAnsi" w:cstheme="minorHAnsi"/>
           <w:sz w:val="22"/>
           <w:szCs w:val="22"/>
-          <w:highlight w:val="yellow"/>
         </w:rPr>
         <w:lastRenderedPageBreak/>
         <w:t>Import</w:t>
@@ -1261,7 +1196,6 @@
           <w:rFonts w:asciiTheme="minorHAnsi" w:hAnsiTheme="minorHAnsi" w:cstheme="minorHAnsi"/>
           <w:sz w:val="22"/>
           <w:szCs w:val="22"/>
-          <w:highlight w:val="yellow"/>
         </w:rPr>
         <w:t>: Load the created Views (</w:t>
       </w:r>
@@ -1272,7 +1206,6 @@
           <w:rFonts w:asciiTheme="minorHAnsi" w:hAnsiTheme="minorHAnsi" w:cstheme="minorHAnsi"/>
           <w:sz w:val="22"/>
           <w:szCs w:val="22"/>
-          <w:highlight w:val="yellow"/>
         </w:rPr>
         <w:t>v_Product_Enriched</w:t>
       </w:r>
@@ -1282,7 +1215,6 @@
           <w:rFonts w:asciiTheme="minorHAnsi" w:hAnsiTheme="minorHAnsi" w:cstheme="minorHAnsi"/>
           <w:sz w:val="22"/>
           <w:szCs w:val="22"/>
-          <w:highlight w:val="yellow"/>
         </w:rPr>
         <w:t xml:space="preserve">, </w:t>
       </w:r>
@@ -1293,7 +1225,6 @@
           <w:rFonts w:asciiTheme="minorHAnsi" w:hAnsiTheme="minorHAnsi" w:cstheme="minorHAnsi"/>
           <w:sz w:val="22"/>
           <w:szCs w:val="22"/>
-          <w:highlight w:val="yellow"/>
         </w:rPr>
         <w:t>v_Order_Sales</w:t>
       </w:r>
@@ -1303,7 +1234,6 @@
           <w:rFonts w:asciiTheme="minorHAnsi" w:hAnsiTheme="minorHAnsi" w:cstheme="minorHAnsi"/>
           <w:sz w:val="22"/>
           <w:szCs w:val="22"/>
-          <w:highlight w:val="yellow"/>
         </w:rPr>
         <w:t xml:space="preserve">, </w:t>
       </w:r>
@@ -1314,7 +1244,6 @@
           <w:rFonts w:asciiTheme="minorHAnsi" w:hAnsiTheme="minorHAnsi" w:cstheme="minorHAnsi"/>
           <w:sz w:val="22"/>
           <w:szCs w:val="22"/>
-          <w:highlight w:val="yellow"/>
         </w:rPr>
         <w:t>v_Customer_Geo</w:t>
       </w:r>
@@ -1324,7 +1253,6 @@
           <w:rFonts w:asciiTheme="minorHAnsi" w:hAnsiTheme="minorHAnsi" w:cstheme="minorHAnsi"/>
           <w:sz w:val="22"/>
           <w:szCs w:val="22"/>
-          <w:highlight w:val="yellow"/>
         </w:rPr>
         <w:t xml:space="preserve">) and the tables </w:t>
       </w:r>
@@ -1334,7 +1262,6 @@
           <w:rFonts w:asciiTheme="minorHAnsi" w:hAnsiTheme="minorHAnsi" w:cstheme="minorHAnsi"/>
           <w:sz w:val="22"/>
           <w:szCs w:val="22"/>
-          <w:highlight w:val="yellow"/>
         </w:rPr>
         <w:t>employees</w:t>
       </w:r>
@@ -1343,7 +1270,6 @@
           <w:rFonts w:asciiTheme="minorHAnsi" w:hAnsiTheme="minorHAnsi" w:cstheme="minorHAnsi"/>
           <w:sz w:val="22"/>
           <w:szCs w:val="22"/>
-          <w:highlight w:val="yellow"/>
         </w:rPr>
         <w:t xml:space="preserve"> and </w:t>
       </w:r>
@@ -1353,7 +1279,6 @@
           <w:rFonts w:asciiTheme="minorHAnsi" w:hAnsiTheme="minorHAnsi" w:cstheme="minorHAnsi"/>
           <w:sz w:val="22"/>
           <w:szCs w:val="22"/>
-          <w:highlight w:val="yellow"/>
         </w:rPr>
         <w:t>shippers</w:t>
       </w:r>
@@ -1362,7 +1287,6 @@
           <w:rFonts w:asciiTheme="minorHAnsi" w:hAnsiTheme="minorHAnsi" w:cstheme="minorHAnsi"/>
           <w:sz w:val="22"/>
           <w:szCs w:val="22"/>
-          <w:highlight w:val="yellow"/>
         </w:rPr>
         <w:t>.</w:t>
       </w:r>
@@ -1378,7 +1302,6 @@
           <w:rFonts w:asciiTheme="minorHAnsi" w:hAnsiTheme="minorHAnsi" w:cstheme="minorHAnsi"/>
           <w:sz w:val="22"/>
           <w:szCs w:val="22"/>
-          <w:highlight w:val="yellow"/>
         </w:rPr>
       </w:pPr>
       <w:r>
@@ -1387,7 +1310,6 @@
           <w:rFonts w:asciiTheme="minorHAnsi" w:hAnsiTheme="minorHAnsi" w:cstheme="minorHAnsi"/>
           <w:sz w:val="22"/>
           <w:szCs w:val="22"/>
-          <w:highlight w:val="yellow"/>
         </w:rPr>
         <w:t>Transformation (Power Query)</w:t>
       </w:r>
@@ -1396,7 +1318,6 @@
           <w:rFonts w:asciiTheme="minorHAnsi" w:hAnsiTheme="minorHAnsi" w:cstheme="minorHAnsi"/>
           <w:sz w:val="22"/>
           <w:szCs w:val="22"/>
-          <w:highlight w:val="yellow"/>
         </w:rPr>
         <w:t>:</w:t>
       </w:r>
@@ -1412,15 +1333,13 @@
           <w:rFonts w:asciiTheme="minorHAnsi" w:hAnsiTheme="minorHAnsi" w:cstheme="minorHAnsi"/>
           <w:sz w:val="22"/>
           <w:szCs w:val="22"/>
-          <w:highlight w:val="yellow"/>
-        </w:rPr>
-      </w:pPr>
-      <w:r>
-        <w:rPr>
-          <w:rFonts w:asciiTheme="minorHAnsi" w:hAnsiTheme="minorHAnsi" w:cstheme="minorHAnsi"/>
-          <w:sz w:val="22"/>
-          <w:szCs w:val="22"/>
-          <w:highlight w:val="yellow"/>
+        </w:rPr>
+      </w:pPr>
+      <w:r>
+        <w:rPr>
+          <w:rFonts w:asciiTheme="minorHAnsi" w:hAnsiTheme="minorHAnsi" w:cstheme="minorHAnsi"/>
+          <w:sz w:val="22"/>
+          <w:szCs w:val="22"/>
         </w:rPr>
         <w:t>Ensure data types are correct (Currency, Dates).</w:t>
       </w:r>
@@ -1436,15 +1355,13 @@
           <w:rFonts w:asciiTheme="minorHAnsi" w:hAnsiTheme="minorHAnsi" w:cstheme="minorHAnsi"/>
           <w:sz w:val="22"/>
           <w:szCs w:val="22"/>
-          <w:highlight w:val="yellow"/>
-        </w:rPr>
-      </w:pPr>
-      <w:r>
-        <w:rPr>
-          <w:rFonts w:asciiTheme="minorHAnsi" w:hAnsiTheme="minorHAnsi" w:cstheme="minorHAnsi"/>
-          <w:sz w:val="22"/>
-          <w:szCs w:val="22"/>
-          <w:highlight w:val="yellow"/>
+        </w:rPr>
+      </w:pPr>
+      <w:r>
+        <w:rPr>
+          <w:rFonts w:asciiTheme="minorHAnsi" w:hAnsiTheme="minorHAnsi" w:cstheme="minorHAnsi"/>
+          <w:sz w:val="22"/>
+          <w:szCs w:val="22"/>
         </w:rPr>
         <w:t xml:space="preserve">Rename technical column names (e.g. </w:t>
       </w:r>
@@ -1455,7 +1372,6 @@
           <w:rFonts w:asciiTheme="minorHAnsi" w:hAnsiTheme="minorHAnsi" w:cstheme="minorHAnsi"/>
           <w:sz w:val="22"/>
           <w:szCs w:val="22"/>
-          <w:highlight w:val="yellow"/>
         </w:rPr>
         <w:t>shipped_date</w:t>
       </w:r>
@@ -1465,7 +1381,6 @@
           <w:rFonts w:asciiTheme="minorHAnsi" w:hAnsiTheme="minorHAnsi" w:cstheme="minorHAnsi"/>
           <w:sz w:val="22"/>
           <w:szCs w:val="22"/>
-          <w:highlight w:val="yellow"/>
         </w:rPr>
         <w:t xml:space="preserve"> → </w:t>
       </w:r>
@@ -1475,7 +1390,6 @@
           <w:rFonts w:asciiTheme="minorHAnsi" w:hAnsiTheme="minorHAnsi" w:cstheme="minorHAnsi"/>
           <w:sz w:val="22"/>
           <w:szCs w:val="22"/>
-          <w:highlight w:val="yellow"/>
         </w:rPr>
         <w:t>Shipping Date</w:t>
       </w:r>
@@ -1484,7 +1398,6 @@
           <w:rFonts w:asciiTheme="minorHAnsi" w:hAnsiTheme="minorHAnsi" w:cstheme="minorHAnsi"/>
           <w:sz w:val="22"/>
           <w:szCs w:val="22"/>
-          <w:highlight w:val="yellow"/>
         </w:rPr>
         <w:t>).</w:t>
       </w:r>
@@ -1500,7 +1413,6 @@
           <w:rFonts w:asciiTheme="minorHAnsi" w:hAnsiTheme="minorHAnsi" w:cstheme="minorHAnsi"/>
           <w:sz w:val="22"/>
           <w:szCs w:val="22"/>
-          <w:highlight w:val="yellow"/>
         </w:rPr>
       </w:pPr>
       <w:r>
@@ -1509,7 +1421,6 @@
           <w:rFonts w:asciiTheme="minorHAnsi" w:hAnsiTheme="minorHAnsi" w:cstheme="minorHAnsi"/>
           <w:sz w:val="22"/>
           <w:szCs w:val="22"/>
-          <w:highlight w:val="yellow"/>
         </w:rPr>
         <w:t>Relationships</w:t>
       </w:r>
@@ -1518,7 +1429,6 @@
           <w:rFonts w:asciiTheme="minorHAnsi" w:hAnsiTheme="minorHAnsi" w:cstheme="minorHAnsi"/>
           <w:sz w:val="22"/>
           <w:szCs w:val="22"/>
-          <w:highlight w:val="yellow"/>
         </w:rPr>
         <w:t>:</w:t>
       </w:r>
@@ -1534,15 +1444,13 @@
           <w:rFonts w:asciiTheme="minorHAnsi" w:hAnsiTheme="minorHAnsi" w:cstheme="minorHAnsi"/>
           <w:sz w:val="22"/>
           <w:szCs w:val="22"/>
-          <w:highlight w:val="yellow"/>
-        </w:rPr>
-      </w:pPr>
-      <w:r>
-        <w:rPr>
-          <w:rFonts w:asciiTheme="minorHAnsi" w:hAnsiTheme="minorHAnsi" w:cstheme="minorHAnsi"/>
-          <w:sz w:val="22"/>
-          <w:szCs w:val="22"/>
-          <w:highlight w:val="yellow"/>
+        </w:rPr>
+      </w:pPr>
+      <w:r>
+        <w:rPr>
+          <w:rFonts w:asciiTheme="minorHAnsi" w:hAnsiTheme="minorHAnsi" w:cstheme="minorHAnsi"/>
+          <w:sz w:val="22"/>
+          <w:szCs w:val="22"/>
         </w:rPr>
         <w:t xml:space="preserve">Build a </w:t>
       </w:r>
@@ -1552,7 +1460,6 @@
           <w:rFonts w:asciiTheme="minorHAnsi" w:hAnsiTheme="minorHAnsi" w:cstheme="minorHAnsi"/>
           <w:sz w:val="22"/>
           <w:szCs w:val="22"/>
-          <w:highlight w:val="yellow"/>
         </w:rPr>
         <w:t>Star Schema</w:t>
       </w:r>
@@ -1561,7 +1468,6 @@
           <w:rFonts w:asciiTheme="minorHAnsi" w:hAnsiTheme="minorHAnsi" w:cstheme="minorHAnsi"/>
           <w:sz w:val="22"/>
           <w:szCs w:val="22"/>
-          <w:highlight w:val="yellow"/>
         </w:rPr>
         <w:t xml:space="preserve"> model with fact and dimension tables.</w:t>
       </w:r>
@@ -1577,15 +1483,13 @@
           <w:rFonts w:asciiTheme="minorHAnsi" w:hAnsiTheme="minorHAnsi" w:cstheme="minorHAnsi"/>
           <w:sz w:val="22"/>
           <w:szCs w:val="22"/>
-          <w:highlight w:val="yellow"/>
-        </w:rPr>
-      </w:pPr>
-      <w:r>
-        <w:rPr>
-          <w:rFonts w:asciiTheme="minorHAnsi" w:hAnsiTheme="minorHAnsi" w:cstheme="minorHAnsi"/>
-          <w:sz w:val="22"/>
-          <w:szCs w:val="22"/>
-          <w:highlight w:val="yellow"/>
+        </w:rPr>
+      </w:pPr>
+      <w:r>
+        <w:rPr>
+          <w:rFonts w:asciiTheme="minorHAnsi" w:hAnsiTheme="minorHAnsi" w:cstheme="minorHAnsi"/>
+          <w:sz w:val="22"/>
+          <w:szCs w:val="22"/>
         </w:rPr>
         <w:t xml:space="preserve">Create a separate </w:t>
       </w:r>
@@ -1595,7 +1499,6 @@
           <w:rFonts w:asciiTheme="minorHAnsi" w:hAnsiTheme="minorHAnsi" w:cstheme="minorHAnsi"/>
           <w:sz w:val="22"/>
           <w:szCs w:val="22"/>
-          <w:highlight w:val="yellow"/>
         </w:rPr>
         <w:t>Date/Calendar Table</w:t>
       </w:r>
@@ -1604,7 +1507,6 @@
           <w:rFonts w:asciiTheme="minorHAnsi" w:hAnsiTheme="minorHAnsi" w:cstheme="minorHAnsi"/>
           <w:sz w:val="22"/>
           <w:szCs w:val="22"/>
-          <w:highlight w:val="yellow"/>
         </w:rPr>
         <w:t xml:space="preserve"> using DAX.</w:t>
       </w:r>
@@ -1620,15 +1522,13 @@
           <w:rFonts w:asciiTheme="minorHAnsi" w:hAnsiTheme="minorHAnsi" w:cstheme="minorHAnsi"/>
           <w:sz w:val="22"/>
           <w:szCs w:val="22"/>
-          <w:highlight w:val="yellow"/>
-        </w:rPr>
-      </w:pPr>
-      <w:r>
-        <w:rPr>
-          <w:rFonts w:asciiTheme="minorHAnsi" w:hAnsiTheme="minorHAnsi" w:cstheme="minorHAnsi"/>
-          <w:sz w:val="22"/>
-          <w:szCs w:val="22"/>
-          <w:highlight w:val="yellow"/>
+        </w:rPr>
+      </w:pPr>
+      <w:r>
+        <w:rPr>
+          <w:rFonts w:asciiTheme="minorHAnsi" w:hAnsiTheme="minorHAnsi" w:cstheme="minorHAnsi"/>
+          <w:sz w:val="22"/>
+          <w:szCs w:val="22"/>
         </w:rPr>
         <w:t>Correctly connect the dimensions (Customers, Employees, Dates, Products, Shippers) to the fact table (</w:t>
       </w:r>
@@ -1639,7 +1539,6 @@
           <w:rFonts w:asciiTheme="minorHAnsi" w:hAnsiTheme="minorHAnsi" w:cstheme="minorHAnsi"/>
           <w:sz w:val="22"/>
           <w:szCs w:val="22"/>
-          <w:highlight w:val="yellow"/>
         </w:rPr>
         <w:t>v_Order_Sales</w:t>
       </w:r>
@@ -1649,7 +1548,6 @@
           <w:rFonts w:asciiTheme="minorHAnsi" w:hAnsiTheme="minorHAnsi" w:cstheme="minorHAnsi"/>
           <w:sz w:val="22"/>
           <w:szCs w:val="22"/>
-          <w:highlight w:val="yellow"/>
         </w:rPr>
         <w:t>).</w:t>
       </w:r>
@@ -1674,15 +1572,13 @@
           <w:rFonts w:asciiTheme="minorHAnsi" w:hAnsiTheme="minorHAnsi" w:cstheme="minorHAnsi"/>
           <w:sz w:val="22"/>
           <w:szCs w:val="22"/>
-          <w:highlight w:val="yellow"/>
-        </w:rPr>
-      </w:pPr>
-      <w:r>
-        <w:rPr>
-          <w:rFonts w:asciiTheme="minorHAnsi" w:hAnsiTheme="minorHAnsi" w:cstheme="minorHAnsi"/>
-          <w:sz w:val="22"/>
-          <w:szCs w:val="22"/>
-          <w:highlight w:val="yellow"/>
+        </w:rPr>
+      </w:pPr>
+      <w:r>
+        <w:rPr>
+          <w:rFonts w:asciiTheme="minorHAnsi" w:hAnsiTheme="minorHAnsi" w:cstheme="minorHAnsi"/>
+          <w:sz w:val="22"/>
+          <w:szCs w:val="22"/>
         </w:rPr>
         <w:t xml:space="preserve">Create a table named </w:t>
       </w:r>
@@ -1692,7 +1588,6 @@
           <w:rFonts w:asciiTheme="minorHAnsi" w:hAnsiTheme="minorHAnsi" w:cstheme="minorHAnsi"/>
           <w:sz w:val="22"/>
           <w:szCs w:val="22"/>
-          <w:highlight w:val="yellow"/>
         </w:rPr>
         <w:t>_Measures</w:t>
       </w:r>
@@ -1701,7 +1596,6 @@
           <w:rFonts w:asciiTheme="minorHAnsi" w:hAnsiTheme="minorHAnsi" w:cstheme="minorHAnsi"/>
           <w:sz w:val="22"/>
           <w:szCs w:val="22"/>
-          <w:highlight w:val="yellow"/>
         </w:rPr>
         <w:t xml:space="preserve"> and write the following measures:</w:t>
       </w:r>
@@ -1717,7 +1611,6 @@
           <w:rFonts w:asciiTheme="minorHAnsi" w:hAnsiTheme="minorHAnsi" w:cstheme="minorHAnsi"/>
           <w:sz w:val="22"/>
           <w:szCs w:val="22"/>
-          <w:highlight w:val="yellow"/>
         </w:rPr>
       </w:pPr>
       <w:r>
@@ -1726,7 +1619,6 @@
           <w:rFonts w:asciiTheme="minorHAnsi" w:hAnsiTheme="minorHAnsi" w:cstheme="minorHAnsi"/>
           <w:sz w:val="22"/>
           <w:szCs w:val="22"/>
-          <w:highlight w:val="yellow"/>
         </w:rPr>
         <w:t>Basic Measures</w:t>
       </w:r>
@@ -1735,7 +1627,6 @@
           <w:rFonts w:asciiTheme="minorHAnsi" w:hAnsiTheme="minorHAnsi" w:cstheme="minorHAnsi"/>
           <w:sz w:val="22"/>
           <w:szCs w:val="22"/>
-          <w:highlight w:val="yellow"/>
         </w:rPr>
         <w:t>:</w:t>
       </w:r>
@@ -1751,7 +1642,6 @@
           <w:rFonts w:asciiTheme="minorHAnsi" w:hAnsiTheme="minorHAnsi" w:cstheme="minorHAnsi"/>
           <w:sz w:val="22"/>
           <w:szCs w:val="22"/>
-          <w:highlight w:val="yellow"/>
         </w:rPr>
       </w:pPr>
       <w:r>
@@ -1760,7 +1650,6 @@
           <w:rFonts w:asciiTheme="minorHAnsi" w:hAnsiTheme="minorHAnsi" w:cstheme="minorHAnsi"/>
           <w:sz w:val="22"/>
           <w:szCs w:val="22"/>
-          <w:highlight w:val="yellow"/>
         </w:rPr>
         <w:t>Total Revenue</w:t>
       </w:r>
@@ -1769,7 +1658,6 @@
           <w:rFonts w:asciiTheme="minorHAnsi" w:hAnsiTheme="minorHAnsi" w:cstheme="minorHAnsi"/>
           <w:sz w:val="22"/>
           <w:szCs w:val="22"/>
-          <w:highlight w:val="yellow"/>
         </w:rPr>
         <w:t>: Sum of sales.</w:t>
       </w:r>
@@ -1785,7 +1673,6 @@
           <w:rFonts w:asciiTheme="minorHAnsi" w:hAnsiTheme="minorHAnsi" w:cstheme="minorHAnsi"/>
           <w:sz w:val="22"/>
           <w:szCs w:val="22"/>
-          <w:highlight w:val="yellow"/>
         </w:rPr>
       </w:pPr>
       <w:r>
@@ -1794,7 +1681,6 @@
           <w:rFonts w:asciiTheme="minorHAnsi" w:hAnsiTheme="minorHAnsi" w:cstheme="minorHAnsi"/>
           <w:sz w:val="22"/>
           <w:szCs w:val="22"/>
-          <w:highlight w:val="yellow"/>
         </w:rPr>
         <w:t>Total Orders</w:t>
       </w:r>
@@ -1803,7 +1689,6 @@
           <w:rFonts w:asciiTheme="minorHAnsi" w:hAnsiTheme="minorHAnsi" w:cstheme="minorHAnsi"/>
           <w:sz w:val="22"/>
           <w:szCs w:val="22"/>
-          <w:highlight w:val="yellow"/>
         </w:rPr>
         <w:t>: Count of unique orders.</w:t>
       </w:r>
@@ -1819,7 +1704,6 @@
           <w:rFonts w:asciiTheme="minorHAnsi" w:hAnsiTheme="minorHAnsi" w:cstheme="minorHAnsi"/>
           <w:sz w:val="22"/>
           <w:szCs w:val="22"/>
-          <w:highlight w:val="yellow"/>
         </w:rPr>
       </w:pPr>
       <w:r>
@@ -1828,7 +1712,6 @@
           <w:rFonts w:asciiTheme="minorHAnsi" w:hAnsiTheme="minorHAnsi" w:cstheme="minorHAnsi"/>
           <w:sz w:val="22"/>
           <w:szCs w:val="22"/>
-          <w:highlight w:val="yellow"/>
         </w:rPr>
         <w:t>Average Order Value (AOV)</w:t>
       </w:r>
@@ -1837,7 +1720,6 @@
           <w:rFonts w:asciiTheme="minorHAnsi" w:hAnsiTheme="minorHAnsi" w:cstheme="minorHAnsi"/>
           <w:sz w:val="22"/>
           <w:szCs w:val="22"/>
-          <w:highlight w:val="yellow"/>
         </w:rPr>
         <w:t xml:space="preserve">: </w:t>
       </w:r>
@@ -1847,7 +1729,6 @@
           <w:rFonts w:asciiTheme="minorHAnsi" w:hAnsiTheme="minorHAnsi" w:cstheme="minorHAnsi"/>
           <w:sz w:val="22"/>
           <w:szCs w:val="22"/>
-          <w:highlight w:val="yellow"/>
         </w:rPr>
         <w:t>Total Revenue / Total Orders</w:t>
       </w:r>
@@ -1856,7 +1737,6 @@
           <w:rFonts w:asciiTheme="minorHAnsi" w:hAnsiTheme="minorHAnsi" w:cstheme="minorHAnsi"/>
           <w:sz w:val="22"/>
           <w:szCs w:val="22"/>
-          <w:highlight w:val="yellow"/>
         </w:rPr>
         <w:t>.</w:t>
       </w:r>
@@ -1872,7 +1752,6 @@
           <w:rFonts w:asciiTheme="minorHAnsi" w:hAnsiTheme="minorHAnsi" w:cstheme="minorHAnsi"/>
           <w:sz w:val="22"/>
           <w:szCs w:val="22"/>
-          <w:highlight w:val="yellow"/>
         </w:rPr>
       </w:pPr>
       <w:r>
@@ -1881,7 +1760,6 @@
           <w:rFonts w:asciiTheme="minorHAnsi" w:hAnsiTheme="minorHAnsi" w:cstheme="minorHAnsi"/>
           <w:sz w:val="22"/>
           <w:szCs w:val="22"/>
-          <w:highlight w:val="yellow"/>
         </w:rPr>
         <w:t>Total Quantity Sold</w:t>
       </w:r>
@@ -1890,7 +1768,6 @@
           <w:rFonts w:asciiTheme="minorHAnsi" w:hAnsiTheme="minorHAnsi" w:cstheme="minorHAnsi"/>
           <w:sz w:val="22"/>
           <w:szCs w:val="22"/>
-          <w:highlight w:val="yellow"/>
         </w:rPr>
         <w:t>: Total number of items sold.</w:t>
       </w:r>
@@ -1906,7 +1783,6 @@
           <w:rFonts w:asciiTheme="minorHAnsi" w:hAnsiTheme="minorHAnsi" w:cstheme="minorHAnsi"/>
           <w:sz w:val="22"/>
           <w:szCs w:val="22"/>
-          <w:highlight w:val="yellow"/>
         </w:rPr>
       </w:pPr>
       <w:r>
@@ -1915,7 +1791,6 @@
           <w:rFonts w:asciiTheme="minorHAnsi" w:hAnsiTheme="minorHAnsi" w:cstheme="minorHAnsi"/>
           <w:sz w:val="22"/>
           <w:szCs w:val="22"/>
-          <w:highlight w:val="yellow"/>
         </w:rPr>
         <w:t>Time Intelligence</w:t>
       </w:r>
@@ -1924,7 +1799,6 @@
           <w:rFonts w:asciiTheme="minorHAnsi" w:hAnsiTheme="minorHAnsi" w:cstheme="minorHAnsi"/>
           <w:sz w:val="22"/>
           <w:szCs w:val="22"/>
-          <w:highlight w:val="yellow"/>
         </w:rPr>
         <w:t>:</w:t>
       </w:r>
@@ -1940,7 +1814,6 @@
           <w:rFonts w:asciiTheme="minorHAnsi" w:hAnsiTheme="minorHAnsi" w:cstheme="minorHAnsi"/>
           <w:sz w:val="22"/>
           <w:szCs w:val="22"/>
-          <w:highlight w:val="yellow"/>
         </w:rPr>
       </w:pPr>
       <w:r>
@@ -1949,7 +1822,6 @@
           <w:rFonts w:asciiTheme="minorHAnsi" w:hAnsiTheme="minorHAnsi" w:cstheme="minorHAnsi"/>
           <w:sz w:val="22"/>
           <w:szCs w:val="22"/>
-          <w:highlight w:val="yellow"/>
         </w:rPr>
         <w:t>Revenue YTD</w:t>
       </w:r>
@@ -1958,7 +1830,6 @@
           <w:rFonts w:asciiTheme="minorHAnsi" w:hAnsiTheme="minorHAnsi" w:cstheme="minorHAnsi"/>
           <w:sz w:val="22"/>
           <w:szCs w:val="22"/>
-          <w:highlight w:val="yellow"/>
         </w:rPr>
         <w:t>: Sales from the beginning of the year to date.</w:t>
       </w:r>
@@ -1974,7 +1845,6 @@
           <w:rFonts w:asciiTheme="minorHAnsi" w:hAnsiTheme="minorHAnsi" w:cstheme="minorHAnsi"/>
           <w:sz w:val="22"/>
           <w:szCs w:val="22"/>
-          <w:highlight w:val="yellow"/>
         </w:rPr>
       </w:pPr>
       <w:r>
@@ -1983,7 +1853,6 @@
           <w:rFonts w:asciiTheme="minorHAnsi" w:hAnsiTheme="minorHAnsi" w:cstheme="minorHAnsi"/>
           <w:sz w:val="22"/>
           <w:szCs w:val="22"/>
-          <w:highlight w:val="yellow"/>
         </w:rPr>
         <w:t>Revenue Previous Year</w:t>
       </w:r>
@@ -1992,7 +1861,6 @@
           <w:rFonts w:asciiTheme="minorHAnsi" w:hAnsiTheme="minorHAnsi" w:cstheme="minorHAnsi"/>
           <w:sz w:val="22"/>
           <w:szCs w:val="22"/>
-          <w:highlight w:val="yellow"/>
         </w:rPr>
         <w:t>: Sales for the same period in the previous year.</w:t>
       </w:r>
@@ -2008,7 +1876,6 @@
           <w:rFonts w:asciiTheme="minorHAnsi" w:hAnsiTheme="minorHAnsi" w:cstheme="minorHAnsi"/>
           <w:sz w:val="22"/>
           <w:szCs w:val="22"/>
-          <w:highlight w:val="yellow"/>
         </w:rPr>
       </w:pPr>
       <w:r>
@@ -2017,7 +1884,6 @@
           <w:rFonts w:asciiTheme="minorHAnsi" w:hAnsiTheme="minorHAnsi" w:cstheme="minorHAnsi"/>
           <w:sz w:val="22"/>
           <w:szCs w:val="22"/>
-          <w:highlight w:val="yellow"/>
         </w:rPr>
         <w:t>YoY Growth %</w:t>
       </w:r>
@@ -2026,7 +1892,6 @@
           <w:rFonts w:asciiTheme="minorHAnsi" w:hAnsiTheme="minorHAnsi" w:cstheme="minorHAnsi"/>
           <w:sz w:val="22"/>
           <w:szCs w:val="22"/>
-          <w:highlight w:val="yellow"/>
         </w:rPr>
         <w:t>: Year-over-year growth percentage.</w:t>
       </w:r>
@@ -2042,7 +1907,6 @@
           <w:rFonts w:asciiTheme="minorHAnsi" w:hAnsiTheme="minorHAnsi" w:cstheme="minorHAnsi"/>
           <w:sz w:val="22"/>
           <w:szCs w:val="22"/>
-          <w:highlight w:val="yellow"/>
         </w:rPr>
       </w:pPr>
       <w:r>
@@ -2051,7 +1915,6 @@
           <w:rFonts w:asciiTheme="minorHAnsi" w:hAnsiTheme="minorHAnsi" w:cstheme="minorHAnsi"/>
           <w:sz w:val="22"/>
           <w:szCs w:val="22"/>
-          <w:highlight w:val="yellow"/>
         </w:rPr>
         <w:t>Business Logic</w:t>
       </w:r>
@@ -2060,7 +1923,6 @@
           <w:rFonts w:asciiTheme="minorHAnsi" w:hAnsiTheme="minorHAnsi" w:cstheme="minorHAnsi"/>
           <w:sz w:val="22"/>
           <w:szCs w:val="22"/>
-          <w:highlight w:val="yellow"/>
         </w:rPr>
         <w:t>:</w:t>
       </w:r>
@@ -2076,7 +1938,6 @@
           <w:rFonts w:asciiTheme="minorHAnsi" w:hAnsiTheme="minorHAnsi" w:cstheme="minorHAnsi"/>
           <w:sz w:val="22"/>
           <w:szCs w:val="22"/>
-          <w:highlight w:val="yellow"/>
         </w:rPr>
       </w:pPr>
       <w:r>
@@ -2085,7 +1946,6 @@
           <w:rFonts w:asciiTheme="minorHAnsi" w:hAnsiTheme="minorHAnsi" w:cstheme="minorHAnsi"/>
           <w:sz w:val="22"/>
           <w:szCs w:val="22"/>
-          <w:highlight w:val="yellow"/>
         </w:rPr>
         <w:t>% Discounted</w:t>
       </w:r>
@@ -2094,7 +1954,6 @@
           <w:rFonts w:asciiTheme="minorHAnsi" w:hAnsiTheme="minorHAnsi" w:cstheme="minorHAnsi"/>
           <w:sz w:val="22"/>
           <w:szCs w:val="22"/>
-          <w:highlight w:val="yellow"/>
         </w:rPr>
         <w:t>: Percentage of revenue generated with a discount.</w:t>
       </w:r>
@@ -2110,7 +1969,6 @@
           <w:rFonts w:asciiTheme="minorHAnsi" w:hAnsiTheme="minorHAnsi" w:cstheme="minorHAnsi"/>
           <w:sz w:val="22"/>
           <w:szCs w:val="22"/>
-          <w:highlight w:val="yellow"/>
         </w:rPr>
       </w:pPr>
       <w:r>
@@ -2119,7 +1977,6 @@
           <w:rFonts w:asciiTheme="minorHAnsi" w:hAnsiTheme="minorHAnsi" w:cstheme="minorHAnsi"/>
           <w:sz w:val="22"/>
           <w:szCs w:val="22"/>
-          <w:highlight w:val="yellow"/>
         </w:rPr>
         <w:t>Top Product Sales</w:t>
       </w:r>
@@ -2128,7 +1985,6 @@
           <w:rFonts w:asciiTheme="minorHAnsi" w:hAnsiTheme="minorHAnsi" w:cstheme="minorHAnsi"/>
           <w:sz w:val="22"/>
           <w:szCs w:val="22"/>
-          <w:highlight w:val="yellow"/>
         </w:rPr>
         <w:t xml:space="preserve">: Sales of the top 3 best-selling products (use </w:t>
       </w:r>
@@ -2138,7 +1994,6 @@
           <w:rFonts w:asciiTheme="minorHAnsi" w:hAnsiTheme="minorHAnsi" w:cstheme="minorHAnsi"/>
           <w:sz w:val="22"/>
           <w:szCs w:val="22"/>
-          <w:highlight w:val="yellow"/>
         </w:rPr>
         <w:t>TOPN</w:t>
       </w:r>
@@ -2147,7 +2002,6 @@
           <w:rFonts w:asciiTheme="minorHAnsi" w:hAnsiTheme="minorHAnsi" w:cstheme="minorHAnsi"/>
           <w:sz w:val="22"/>
           <w:szCs w:val="22"/>
-          <w:highlight w:val="yellow"/>
         </w:rPr>
         <w:t xml:space="preserve"> or </w:t>
       </w:r>
@@ -2157,7 +2011,6 @@
           <w:rFonts w:asciiTheme="minorHAnsi" w:hAnsiTheme="minorHAnsi" w:cstheme="minorHAnsi"/>
           <w:sz w:val="22"/>
           <w:szCs w:val="22"/>
-          <w:highlight w:val="yellow"/>
         </w:rPr>
         <w:t>RANKX</w:t>
       </w:r>
@@ -2166,7 +2019,6 @@
           <w:rFonts w:asciiTheme="minorHAnsi" w:hAnsiTheme="minorHAnsi" w:cstheme="minorHAnsi"/>
           <w:sz w:val="22"/>
           <w:szCs w:val="22"/>
-          <w:highlight w:val="yellow"/>
         </w:rPr>
         <w:t>).</w:t>
       </w:r>
@@ -2175,8 +2027,6 @@
       <w:pPr>
         <w:pStyle w:val="Heading3"/>
       </w:pPr>
-      <w:bookmarkStart w:id="0" w:name="_GoBack"/>
-      <w:bookmarkEnd w:id="0"/>
       <w:r>
         <w:rPr>
           <w:rStyle w:val="Strong"/>
@@ -3342,7 +3192,7 @@
             </wp:anchor>
           </w:drawing>
         </mc:Choice>
-        <mc:Fallback xmlns:w16se="http://schemas.microsoft.com/office/word/2015/wordml/symex" xmlns:w16sdtdh="http://schemas.microsoft.com/office/word/2020/wordml/sdtdatahash" xmlns:w16="http://schemas.microsoft.com/office/word/2018/wordml" xmlns:w16cid="http://schemas.microsoft.com/office/word/2016/wordml/cid" xmlns:w16cex="http://schemas.microsoft.com/office/word/2018/wordml/cex" xmlns:w15="http://schemas.microsoft.com/office/word/2012/wordml" xmlns:am3d="http://schemas.microsoft.com/office/drawing/2017/model3d" xmlns:aink="http://schemas.microsoft.com/office/drawing/2016/ink" xmlns:cx8="http://schemas.microsoft.com/office/drawing/2016/5/14/chartex" xmlns:cx7="http://schemas.microsoft.com/office/drawing/2016/5/13/chartex" xmlns:cx6="http://schemas.microsoft.com/office/drawing/2016/5/12/chartex" xmlns:cx5="http://schemas.microsoft.com/office/drawing/2016/5/11/chartex" xmlns:cx4="http://schemas.microsoft.com/office/drawing/2016/5/10/chartex" xmlns:cx3="http://schemas.microsoft.com/office/drawing/2016/5/9/chartex" xmlns:cx2="http://schemas.microsoft.com/office/drawing/2015/10/21/chartex" xmlns:cx1="http://schemas.microsoft.com/office/drawing/2015/9/8/chartex" xmlns:cx="http://schemas.microsoft.com/office/drawing/2014/chartex">
+        <mc:Fallback xmlns:cx="http://schemas.microsoft.com/office/drawing/2014/chartex" xmlns:cx1="http://schemas.microsoft.com/office/drawing/2015/9/8/chartex" xmlns:cx2="http://schemas.microsoft.com/office/drawing/2015/10/21/chartex" xmlns:cx3="http://schemas.microsoft.com/office/drawing/2016/5/9/chartex" xmlns:cx4="http://schemas.microsoft.com/office/drawing/2016/5/10/chartex" xmlns:cx5="http://schemas.microsoft.com/office/drawing/2016/5/11/chartex" xmlns:cx6="http://schemas.microsoft.com/office/drawing/2016/5/12/chartex" xmlns:cx7="http://schemas.microsoft.com/office/drawing/2016/5/13/chartex" xmlns:cx8="http://schemas.microsoft.com/office/drawing/2016/5/14/chartex" xmlns:aink="http://schemas.microsoft.com/office/drawing/2016/ink" xmlns:am3d="http://schemas.microsoft.com/office/drawing/2017/model3d" xmlns:w15="http://schemas.microsoft.com/office/word/2012/wordml" xmlns:w16cex="http://schemas.microsoft.com/office/word/2018/wordml/cex" xmlns:w16cid="http://schemas.microsoft.com/office/word/2016/wordml/cid" xmlns:w16="http://schemas.microsoft.com/office/word/2018/wordml" xmlns:w16sdtdh="http://schemas.microsoft.com/office/word/2020/wordml/sdtdatahash" xmlns:w16se="http://schemas.microsoft.com/office/word/2015/wordml/symex">
           <w:pict>
             <v:shapetype w14:anchorId="41B1E642" id="_x0000_t202" coordsize="21600,21600" o:spt="202" path="m,l,21600r21600,l21600,xe">
               <v:stroke joinstyle="miter"/>
@@ -3807,7 +3657,7 @@
                                               <a14:useLocalDpi xmlns:a14="http://schemas.microsoft.com/office/drawing/2010/main" val="0"/>
                                             </a:ext>
                                             <a:ext uri="{837473B0-CC2E-450A-ABE3-18F120FF3D39}">
-                                              <a1611:picAttrSrcUrl xmlns:a1611="http://schemas.microsoft.com/office/drawing/2016/11/main" xmlns:w16se="http://schemas.microsoft.com/office/word/2015/wordml/symex" xmlns:w16sdtdh="http://schemas.microsoft.com/office/word/2020/wordml/sdtdatahash" xmlns:w16="http://schemas.microsoft.com/office/word/2018/wordml" xmlns:w16cid="http://schemas.microsoft.com/office/word/2016/wordml/cid" xmlns:w16cex="http://schemas.microsoft.com/office/word/2018/wordml/cex" xmlns:w15="http://schemas.microsoft.com/office/word/2012/wordml" xmlns:w="http://schemas.openxmlformats.org/wordprocessingml/2006/main" xmlns:w10="urn:schemas-microsoft-com:office:word" xmlns:v="urn:schemas-microsoft-com:vml" xmlns:o="urn:schemas-microsoft-com:office:office" xmlns:am3d="http://schemas.microsoft.com/office/drawing/2017/model3d" xmlns:aink="http://schemas.microsoft.com/office/drawing/2016/ink" xmlns:cx8="http://schemas.microsoft.com/office/drawing/2016/5/14/chartex" xmlns:cx7="http://schemas.microsoft.com/office/drawing/2016/5/13/chartex" xmlns:cx6="http://schemas.microsoft.com/office/drawing/2016/5/12/chartex" xmlns:cx5="http://schemas.microsoft.com/office/drawing/2016/5/11/chartex" xmlns:cx4="http://schemas.microsoft.com/office/drawing/2016/5/10/chartex" xmlns:cx3="http://schemas.microsoft.com/office/drawing/2016/5/9/chartex" xmlns:cx2="http://schemas.microsoft.com/office/drawing/2015/10/21/chartex" xmlns:cx1="http://schemas.microsoft.com/office/drawing/2015/9/8/chartex" xmlns:cx="http://schemas.microsoft.com/office/drawing/2014/chartex" xmlns="" r:id="rId10"/>
+                                              <a1611:picAttrSrcUrl xmlns="" xmlns:cx="http://schemas.microsoft.com/office/drawing/2014/chartex" xmlns:cx1="http://schemas.microsoft.com/office/drawing/2015/9/8/chartex" xmlns:cx2="http://schemas.microsoft.com/office/drawing/2015/10/21/chartex" xmlns:cx3="http://schemas.microsoft.com/office/drawing/2016/5/9/chartex" xmlns:cx4="http://schemas.microsoft.com/office/drawing/2016/5/10/chartex" xmlns:cx5="http://schemas.microsoft.com/office/drawing/2016/5/11/chartex" xmlns:cx6="http://schemas.microsoft.com/office/drawing/2016/5/12/chartex" xmlns:cx7="http://schemas.microsoft.com/office/drawing/2016/5/13/chartex" xmlns:cx8="http://schemas.microsoft.com/office/drawing/2016/5/14/chartex" xmlns:aink="http://schemas.microsoft.com/office/drawing/2016/ink" xmlns:am3d="http://schemas.microsoft.com/office/drawing/2017/model3d" xmlns:o="urn:schemas-microsoft-com:office:office" xmlns:v="urn:schemas-microsoft-com:vml" xmlns:w10="urn:schemas-microsoft-com:office:word" xmlns:w="http://schemas.openxmlformats.org/wordprocessingml/2006/main" xmlns:w15="http://schemas.microsoft.com/office/word/2012/wordml" xmlns:w16cex="http://schemas.microsoft.com/office/word/2018/wordml/cex" xmlns:w16cid="http://schemas.microsoft.com/office/word/2016/wordml/cid" xmlns:w16="http://schemas.microsoft.com/office/word/2018/wordml" xmlns:w16sdtdh="http://schemas.microsoft.com/office/word/2020/wordml/sdtdatahash" xmlns:w16se="http://schemas.microsoft.com/office/word/2015/wordml/symex" xmlns:a1611="http://schemas.microsoft.com/office/drawing/2016/11/main" r:id="rId10"/>
                                             </a:ext>
                                           </a:extLst>
                                         </a:blip>
@@ -4152,7 +4002,7 @@
             </wp:anchor>
           </w:drawing>
         </mc:Choice>
-        <mc:Fallback xmlns:w16se="http://schemas.microsoft.com/office/word/2015/wordml/symex" xmlns:w16sdtdh="http://schemas.microsoft.com/office/word/2020/wordml/sdtdatahash" xmlns:w16="http://schemas.microsoft.com/office/word/2018/wordml" xmlns:w16cid="http://schemas.microsoft.com/office/word/2016/wordml/cid" xmlns:w16cex="http://schemas.microsoft.com/office/word/2018/wordml/cex" xmlns:w15="http://schemas.microsoft.com/office/word/2012/wordml" xmlns:am3d="http://schemas.microsoft.com/office/drawing/2017/model3d" xmlns:aink="http://schemas.microsoft.com/office/drawing/2016/ink" xmlns:cx8="http://schemas.microsoft.com/office/drawing/2016/5/14/chartex" xmlns:cx7="http://schemas.microsoft.com/office/drawing/2016/5/13/chartex" xmlns:cx6="http://schemas.microsoft.com/office/drawing/2016/5/12/chartex" xmlns:cx5="http://schemas.microsoft.com/office/drawing/2016/5/11/chartex" xmlns:cx4="http://schemas.microsoft.com/office/drawing/2016/5/10/chartex" xmlns:cx3="http://schemas.microsoft.com/office/drawing/2016/5/9/chartex" xmlns:cx2="http://schemas.microsoft.com/office/drawing/2015/10/21/chartex" xmlns:cx1="http://schemas.microsoft.com/office/drawing/2015/9/8/chartex" xmlns:cx="http://schemas.microsoft.com/office/drawing/2014/chartex">
+        <mc:Fallback xmlns:cx="http://schemas.microsoft.com/office/drawing/2014/chartex" xmlns:cx1="http://schemas.microsoft.com/office/drawing/2015/9/8/chartex" xmlns:cx2="http://schemas.microsoft.com/office/drawing/2015/10/21/chartex" xmlns:cx3="http://schemas.microsoft.com/office/drawing/2016/5/9/chartex" xmlns:cx4="http://schemas.microsoft.com/office/drawing/2016/5/10/chartex" xmlns:cx5="http://schemas.microsoft.com/office/drawing/2016/5/11/chartex" xmlns:cx6="http://schemas.microsoft.com/office/drawing/2016/5/12/chartex" xmlns:cx7="http://schemas.microsoft.com/office/drawing/2016/5/13/chartex" xmlns:cx8="http://schemas.microsoft.com/office/drawing/2016/5/14/chartex" xmlns:aink="http://schemas.microsoft.com/office/drawing/2016/ink" xmlns:am3d="http://schemas.microsoft.com/office/drawing/2017/model3d" xmlns:w15="http://schemas.microsoft.com/office/word/2012/wordml" xmlns:w16cex="http://schemas.microsoft.com/office/word/2018/wordml/cex" xmlns:w16cid="http://schemas.microsoft.com/office/word/2016/wordml/cid" xmlns:w16="http://schemas.microsoft.com/office/word/2018/wordml" xmlns:w16sdtdh="http://schemas.microsoft.com/office/word/2020/wordml/sdtdatahash" xmlns:w16se="http://schemas.microsoft.com/office/word/2015/wordml/symex">
           <w:pict>
             <v:shape w14:anchorId="2074F399" id="Text Box 16" o:spid="_x0000_s1027" type="#_x0000_t202" style="position:absolute;margin-left:109pt;margin-top:7pt;width:411.4pt;height:40.45pt;z-index:251657216;visibility:visible;mso-wrap-style:square;mso-width-percent:0;mso-height-percent:0;mso-wrap-distance-left:9pt;mso-wrap-distance-top:0;mso-wrap-distance-right:9pt;mso-wrap-distance-bottom:0;mso-position-horizontal:absolute;mso-position-horizontal-relative:text;mso-position-vertical:absolute;mso-position-vertical-relative:text;mso-width-percent:0;mso-height-percent:0;mso-width-relative:page;mso-height-relative:page;v-text-anchor:top" o:gfxdata="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" filled="f" stroked="f">
               <v:textbox inset=".5mm,1.2mm,.5mm,.5mm">
@@ -5009,7 +4859,7 @@
             </wp:anchor>
           </w:drawing>
         </mc:Choice>
-        <mc:Fallback xmlns:a="http://schemas.openxmlformats.org/drawingml/2006/main" xmlns:pic="http://schemas.openxmlformats.org/drawingml/2006/picture" xmlns:a14="http://schemas.microsoft.com/office/drawing/2010/main" xmlns:a1611="http://schemas.microsoft.com/office/drawing/2016/11/main" xmlns:w16se="http://schemas.microsoft.com/office/word/2015/wordml/symex" xmlns:w16sdtdh="http://schemas.microsoft.com/office/word/2020/wordml/sdtdatahash" xmlns:w16="http://schemas.microsoft.com/office/word/2018/wordml" xmlns:w16cid="http://schemas.microsoft.com/office/word/2016/wordml/cid" xmlns:w16cex="http://schemas.microsoft.com/office/word/2018/wordml/cex" xmlns:w15="http://schemas.microsoft.com/office/word/2012/wordml" xmlns:am3d="http://schemas.microsoft.com/office/drawing/2017/model3d" xmlns:aink="http://schemas.microsoft.com/office/drawing/2016/ink" xmlns:cx8="http://schemas.microsoft.com/office/drawing/2016/5/14/chartex" xmlns:cx7="http://schemas.microsoft.com/office/drawing/2016/5/13/chartex" xmlns:cx6="http://schemas.microsoft.com/office/drawing/2016/5/12/chartex" xmlns:cx5="http://schemas.microsoft.com/office/drawing/2016/5/11/chartex" xmlns:cx4="http://schemas.microsoft.com/office/drawing/2016/5/10/chartex" xmlns:cx3="http://schemas.microsoft.com/office/drawing/2016/5/9/chartex" xmlns:cx2="http://schemas.microsoft.com/office/drawing/2015/10/21/chartex" xmlns:cx1="http://schemas.microsoft.com/office/drawing/2015/9/8/chartex" xmlns:cx="http://schemas.microsoft.com/office/drawing/2014/chartex">
+        <mc:Fallback xmlns:cx="http://schemas.microsoft.com/office/drawing/2014/chartex" xmlns:cx1="http://schemas.microsoft.com/office/drawing/2015/9/8/chartex" xmlns:cx2="http://schemas.microsoft.com/office/drawing/2015/10/21/chartex" xmlns:cx3="http://schemas.microsoft.com/office/drawing/2016/5/9/chartex" xmlns:cx4="http://schemas.microsoft.com/office/drawing/2016/5/10/chartex" xmlns:cx5="http://schemas.microsoft.com/office/drawing/2016/5/11/chartex" xmlns:cx6="http://schemas.microsoft.com/office/drawing/2016/5/12/chartex" xmlns:cx7="http://schemas.microsoft.com/office/drawing/2016/5/13/chartex" xmlns:cx8="http://schemas.microsoft.com/office/drawing/2016/5/14/chartex" xmlns:aink="http://schemas.microsoft.com/office/drawing/2016/ink" xmlns:am3d="http://schemas.microsoft.com/office/drawing/2017/model3d" xmlns:w15="http://schemas.microsoft.com/office/word/2012/wordml" xmlns:w16cex="http://schemas.microsoft.com/office/word/2018/wordml/cex" xmlns:w16cid="http://schemas.microsoft.com/office/word/2016/wordml/cid" xmlns:w16="http://schemas.microsoft.com/office/word/2018/wordml" xmlns:w16sdtdh="http://schemas.microsoft.com/office/word/2020/wordml/sdtdatahash" xmlns:w16se="http://schemas.microsoft.com/office/word/2015/wordml/symex" xmlns:a1611="http://schemas.microsoft.com/office/drawing/2016/11/main" xmlns:a14="http://schemas.microsoft.com/office/drawing/2010/main" xmlns:pic="http://schemas.openxmlformats.org/drawingml/2006/picture" xmlns:a="http://schemas.openxmlformats.org/drawingml/2006/main">
           <w:pict>
             <v:line id="Straight Connector 19" style="position:absolute;flip:y;z-index:251622400;visibility:visible;mso-wrap-style:square;mso-width-percent:0;mso-height-percent:0;mso-wrap-distance-left:9pt;mso-wrap-distance-top:0;mso-wrap-distance-right:9pt;mso-wrap-distance-bottom:0;mso-position-horizontal:absolute;mso-position-horizontal-relative:text;mso-position-vertical:absolute;mso-position-vertical-relative:text;mso-width-percent:0;mso-height-percent:0;mso-width-relative:page;mso-height-relative:page" o:spid="_x0000_s1026" strokecolor="#974706 [1609]" strokeweight="1pt" from="-.1pt,5.2pt" to="520.7pt,5.2pt" w14:anchorId="60BE7D18" o:gfxdata="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">
               <v:stroke endcap="round"/>
@@ -5116,7 +4966,7 @@
                               <w:sz w:val="18"/>
                               <w:szCs w:val="18"/>
                             </w:rPr>
-                            <w:t>2</w:t>
+                            <w:t>3</w:t>
                           </w:r>
                           <w:r>
                             <w:rPr>
@@ -5241,7 +5091,7 @@
                         <w:sz w:val="18"/>
                         <w:szCs w:val="18"/>
                       </w:rPr>
-                      <w:t>2</w:t>
+                      <w:t>3</w:t>
                     </w:r>
                     <w:r>
                       <w:rPr>
@@ -12312,6 +12162,21 @@
 </file>
 
 <file path=customXml/item1.xml><?xml version="1.0" encoding="utf-8"?>
+<p:properties xmlns:p="http://schemas.microsoft.com/office/2006/metadata/properties" xmlns:xsi="http://www.w3.org/2001/XMLSchema-instance" xmlns:pc="http://schemas.microsoft.com/office/infopath/2007/PartnerControls">
+  <documentManagement/>
+</p:properties>
+</file>
+
+<file path=customXml/item2.xml><?xml version="1.0" encoding="utf-8"?>
+<?mso-contentType ?>
+<FormTemplates xmlns="http://schemas.microsoft.com/sharepoint/v3/contenttype/forms">
+  <Display>DocumentLibraryForm</Display>
+  <Edit>DocumentLibraryForm</Edit>
+  <New>DocumentLibraryForm</New>
+</FormTemplates>
+</file>
+
+<file path=customXml/item3.xml><?xml version="1.0" encoding="utf-8"?>
 <ct:contentTypeSchema xmlns:ct="http://schemas.microsoft.com/office/2006/metadata/contentType" xmlns:ma="http://schemas.microsoft.com/office/2006/metadata/properties/metaAttributes" ct:_="" ma:_="" ma:contentTypeName="Document" ma:contentTypeID="0x010100B6C18B0EB80FEC43B96FC4929E3ACDFF" ma:contentTypeVersion="8" ma:contentTypeDescription="Create a new document." ma:contentTypeScope="" ma:versionID="6bb60d0f0e9e47938221aa118ad76888">
   <xsd:schema xmlns:xsd="http://www.w3.org/2001/XMLSchema" xmlns:xs="http://www.w3.org/2001/XMLSchema" xmlns:p="http://schemas.microsoft.com/office/2006/metadata/properties" xmlns:ns2="4f985cec-e092-4bcf-a1e1-b816bd0221d8" targetNamespace="http://schemas.microsoft.com/office/2006/metadata/properties" ma:root="true" ma:fieldsID="d81d7665d4e84f7ea38159bca2b592d6" ns2:_="">
     <xsd:import namespace="4f985cec-e092-4bcf-a1e1-b816bd0221d8"/>
@@ -12483,26 +12348,28 @@
 </ct:contentTypeSchema>
 </file>
 
-<file path=customXml/item2.xml><?xml version="1.0" encoding="utf-8"?>
-<?mso-contentType ?>
-<FormTemplates xmlns="http://schemas.microsoft.com/sharepoint/v3/contenttype/forms">
-  <Display>DocumentLibraryForm</Display>
-  <Edit>DocumentLibraryForm</Edit>
-  <New>DocumentLibraryForm</New>
-</FormTemplates>
-</file>
-
-<file path=customXml/item3.xml><?xml version="1.0" encoding="utf-8"?>
-<p:properties xmlns:p="http://schemas.microsoft.com/office/2006/metadata/properties" xmlns:xsi="http://www.w3.org/2001/XMLSchema-instance" xmlns:pc="http://schemas.microsoft.com/office/infopath/2007/PartnerControls">
-  <documentManagement/>
-</p:properties>
-</file>
-
 <file path=customXml/item4.xml><?xml version="1.0" encoding="utf-8"?>
 <b:Sources xmlns:b="http://schemas.openxmlformats.org/officeDocument/2006/bibliography" xmlns="http://schemas.openxmlformats.org/officeDocument/2006/bibliography" SelectedStyle="\APA.XSL" StyleName="APA"/>
 </file>
 
 <file path=customXml/itemProps1.xml><?xml version="1.0" encoding="utf-8"?>
+<ds:datastoreItem xmlns:ds="http://schemas.openxmlformats.org/officeDocument/2006/customXml" ds:itemID="{642AD100-1791-43AC-8FB0-4D3F7DB735D5}">
+  <ds:schemaRefs>
+    <ds:schemaRef ds:uri="http://schemas.microsoft.com/office/2006/metadata/properties"/>
+    <ds:schemaRef ds:uri="http://schemas.microsoft.com/office/infopath/2007/PartnerControls"/>
+  </ds:schemaRefs>
+</ds:datastoreItem>
+</file>
+
+<file path=customXml/itemProps2.xml><?xml version="1.0" encoding="utf-8"?>
+<ds:datastoreItem xmlns:ds="http://schemas.openxmlformats.org/officeDocument/2006/customXml" ds:itemID="{ABF6E877-42D5-49BF-ABBD-36D5F3F486D6}">
+  <ds:schemaRefs>
+    <ds:schemaRef ds:uri="http://schemas.microsoft.com/sharepoint/v3/contenttype/forms"/>
+  </ds:schemaRefs>
+</ds:datastoreItem>
+</file>
+
+<file path=customXml/itemProps3.xml><?xml version="1.0" encoding="utf-8"?>
 <ds:datastoreItem xmlns:ds="http://schemas.openxmlformats.org/officeDocument/2006/customXml" ds:itemID="{D6ED4560-195A-44FF-8D30-1B344521AFD6}">
   <ds:schemaRefs>
     <ds:schemaRef ds:uri="http://schemas.microsoft.com/office/2006/metadata/contentType"/>
@@ -12520,25 +12387,8 @@
 </ds:datastoreItem>
 </file>
 
-<file path=customXml/itemProps2.xml><?xml version="1.0" encoding="utf-8"?>
-<ds:datastoreItem xmlns:ds="http://schemas.openxmlformats.org/officeDocument/2006/customXml" ds:itemID="{ABF6E877-42D5-49BF-ABBD-36D5F3F486D6}">
-  <ds:schemaRefs>
-    <ds:schemaRef ds:uri="http://schemas.microsoft.com/sharepoint/v3/contenttype/forms"/>
-  </ds:schemaRefs>
-</ds:datastoreItem>
-</file>
-
-<file path=customXml/itemProps3.xml><?xml version="1.0" encoding="utf-8"?>
-<ds:datastoreItem xmlns:ds="http://schemas.openxmlformats.org/officeDocument/2006/customXml" ds:itemID="{642AD100-1791-43AC-8FB0-4D3F7DB735D5}">
-  <ds:schemaRefs>
-    <ds:schemaRef ds:uri="http://schemas.microsoft.com/office/2006/metadata/properties"/>
-    <ds:schemaRef ds:uri="http://schemas.microsoft.com/office/infopath/2007/PartnerControls"/>
-  </ds:schemaRefs>
-</ds:datastoreItem>
-</file>
-
 <file path=customXml/itemProps4.xml><?xml version="1.0" encoding="utf-8"?>
-<ds:datastoreItem xmlns:ds="http://schemas.openxmlformats.org/officeDocument/2006/customXml" ds:itemID="{64D7449B-9957-4561-9E2F-B08B2EA84700}">
+<ds:datastoreItem xmlns:ds="http://schemas.openxmlformats.org/officeDocument/2006/customXml" ds:itemID="{EE49ACD3-67D6-4074-AB00-7389F5EFB5DA}">
   <ds:schemaRefs>
     <ds:schemaRef ds:uri="http://schemas.openxmlformats.org/officeDocument/2006/bibliography"/>
   </ds:schemaRefs>

</xml_diff>